<commit_message>
M08a: disambiguate traversal shorthand (Root vs Right) in Concept Review
The one-line summary used 'R' for both Root and Right (pre (R,L,R), in (L,R,R));
rewritten as pre (Root,L,R), in (L,Root,R), post (L,R,Root) to match the diagram
caption. No content removed. Rebuilt docx.
</commit_message>
<xml_diff>
--- a/SITP/DSA-Notes/M08a_Trees_Binary_BST.docx
+++ b/SITP/DSA-Notes/M08a_Trees_Binary_BST.docx
@@ -6745,13 +6745,13 @@
         <w:t xml:space="preserve"> </w:t>
       </w:r>
       <w:r>
-        <w:t xml:space="preserve">differ by root position: pre (R,L,R), in (L,R,R… i.e.</w:t>
-      </w:r>
-      <w:r>
-        <w:t xml:space="preserve"> </w:t>
-      </w:r>
-      <w:r>
-        <w:t xml:space="preserve">L,Root,R), post (L,R,Root).</w:t>
+        <w:t xml:space="preserve">differ by root position: pre (Root,L,R), in (L,Root,R),</w:t>
+      </w:r>
+      <w:r>
+        <w:t xml:space="preserve"> </w:t>
+      </w:r>
+      <w:r>
+        <w:t xml:space="preserve">post (L,R,Root).</w:t>
       </w:r>
       <w:r>
         <w:t xml:space="preserve"> </w:t>

</xml_diff>